<commit_message>
docs: regenerate rendered + docx after wallet cross-references
Co-Authored-By: Claude Opus 4.8 <noreply@anthropic.com>
Claude-Session: https://claude.ai/code/session_01RwtMRFwzHC7G5CTnGLhgKu
</commit_message>
<xml_diff>
--- a/docs/as-built/docx/billing.docx
+++ b/docs/as-built/docx/billing.docx
@@ -2,7 +2,7 @@
 <file path=word/document.xml><?xml version="1.0" encoding="utf-8"?>
 <w:document xmlns:w="http://schemas.openxmlformats.org/wordprocessingml/2006/main" xmlns:m="http://schemas.openxmlformats.org/officeDocument/2006/math" xmlns:r="http://schemas.openxmlformats.org/officeDocument/2006/relationships" xmlns:o="urn:schemas-microsoft-com:office:office" xmlns:v="urn:schemas-microsoft-com:vml" xmlns:w10="urn:schemas-microsoft-com:office:word" xmlns:a="http://schemas.openxmlformats.org/drawingml/2006/main" xmlns:pic="http://schemas.openxmlformats.org/drawingml/2006/picture" xmlns:wp="http://schemas.openxmlformats.org/drawingml/2006/wordprocessingDrawing">
   <w:body>
-    <w:bookmarkStart w:id="69" w:name="billing--as-built-design"/>
+    <w:bookmarkStart w:id="70" w:name="billing--as-built-design"/>
     <w:p>
       <w:pPr>
         <w:pStyle w:val="Heading1"/>
@@ -999,7 +999,7 @@
               <a:graphicData uri="http://schemas.openxmlformats.org/drawingml/2006/picture">
                 <pic:pic>
                   <pic:nvPicPr>
-                    <pic:cNvPr descr="/tmp/docximg-AYCofU/billing_md_1.png" id="23" name="Picture"/>
+                    <pic:cNvPr descr="/tmp/docximg-o5MXdY/billing_md_1.png" id="23" name="Picture"/>
                     <pic:cNvPicPr>
                       <a:picLocks noChangeArrowheads="1" noChangeAspect="1"/>
                     </pic:cNvPicPr>
@@ -1562,7 +1562,7 @@
               <a:graphicData uri="http://schemas.openxmlformats.org/drawingml/2006/picture">
                 <pic:pic>
                   <pic:nvPicPr>
-                    <pic:cNvPr descr="/tmp/docximg-AYCofU/billing_md_2.png" id="28" name="Picture"/>
+                    <pic:cNvPr descr="/tmp/docximg-o5MXdY/billing_md_2.png" id="28" name="Picture"/>
                     <pic:cNvPicPr>
                       <a:picLocks noChangeArrowheads="1" noChangeAspect="1"/>
                     </pic:cNvPicPr>
@@ -2157,7 +2157,7 @@
               <a:graphicData uri="http://schemas.openxmlformats.org/drawingml/2006/picture">
                 <pic:pic>
                   <pic:nvPicPr>
-                    <pic:cNvPr descr="/tmp/docximg-AYCofU/billing_md_3.png" id="34" name="Picture"/>
+                    <pic:cNvPr descr="/tmp/docximg-o5MXdY/billing_md_3.png" id="34" name="Picture"/>
                     <pic:cNvPicPr>
                       <a:picLocks noChangeArrowheads="1" noChangeAspect="1"/>
                     </pic:cNvPicPr>
@@ -2800,7 +2800,7 @@
     </w:p>
     <w:bookmarkEnd w:id="38"/>
     <w:bookmarkEnd w:id="39"/>
-    <w:bookmarkStart w:id="60" w:name="Xa9e563dc3b35f6ef3588b217c42e71c7f9d18b0"/>
+    <w:bookmarkStart w:id="61" w:name="Xa9e563dc3b35f6ef3588b217c42e71c7f9d18b0"/>
     <w:p>
       <w:pPr>
         <w:pStyle w:val="Heading2"/>
@@ -6083,7 +6083,7 @@
               <a:graphicData uri="http://schemas.openxmlformats.org/drawingml/2006/picture">
                 <pic:pic>
                   <pic:nvPicPr>
-                    <pic:cNvPr descr="/tmp/docximg-AYCofU/billing_md_4.png" id="42" name="Picture"/>
+                    <pic:cNvPr descr="/tmp/docximg-o5MXdY/billing_md_4.png" id="42" name="Picture"/>
                     <pic:cNvPicPr>
                       <a:picLocks noChangeArrowheads="1" noChangeAspect="1"/>
                     </pic:cNvPicPr>
@@ -22534,7 +22534,7 @@
               <a:graphicData uri="http://schemas.openxmlformats.org/drawingml/2006/picture">
                 <pic:pic>
                   <pic:nvPicPr>
-                    <pic:cNvPr descr="/tmp/docximg-AYCofU/billing_md_5.png" id="51" name="Picture"/>
+                    <pic:cNvPr descr="/tmp/docximg-o5MXdY/billing_md_5.png" id="51" name="Picture"/>
                     <pic:cNvPicPr>
                       <a:picLocks noChangeArrowheads="1" noChangeAspect="1"/>
                     </pic:cNvPicPr>
@@ -26633,7 +26633,7 @@
       </w:r>
     </w:p>
     <w:bookmarkEnd w:id="53"/>
-    <w:bookmarkStart w:id="57" w:name="X1c9b2297ef9e4f6b1cde049c7e37640968e21fa"/>
+    <w:bookmarkStart w:id="58" w:name="X1c9b2297ef9e4f6b1cde049c7e37640968e21fa"/>
     <w:p>
       <w:pPr>
         <w:pStyle w:val="Heading3"/>
@@ -26692,10 +26692,45 @@
         <w:pStyle w:val="BlockText"/>
       </w:pPr>
       <w:r>
-        <w:t xml:space="preserve">The multiwallet migration added</w:t>
-      </w:r>
-      <w:r>
-        <w:t xml:space="preserve"> </w:t>
+        <w:t xml:space="preserve">Billing owns the</w:t>
+      </w:r>
+      <w:r>
+        <w:t xml:space="preserve"> </w:t>
+      </w:r>
+      <w:r>
+        <w:rPr>
+          <w:bCs/>
+          <w:b/>
+        </w:rPr>
+        <w:t xml:space="preserve">actual prepaid wallets</w:t>
+      </w:r>
+      <w:r>
+        <w:t xml:space="preserve"> </w:t>
+      </w:r>
+      <w:r>
+        <w:t xml:space="preserve">+ their ledger. The wallet</w:t>
+      </w:r>
+      <w:r>
+        <w:t xml:space="preserve"> </w:t>
+      </w:r>
+      <w:r>
+        <w:rPr>
+          <w:bCs/>
+          <w:b/>
+        </w:rPr>
+        <w:t xml:space="preserve">kinds</w:t>
+      </w:r>
+      <w:r>
+        <w:t xml:space="preserve"> </w:t>
+      </w:r>
+      <w:r>
+        <w:t xml:space="preserve">they reference</w:t>
+      </w:r>
+      <w:r>
+        <w:t xml:space="preserve"> </w:t>
+      </w:r>
+      <w:r>
+        <w:t xml:space="preserve">(</w:t>
       </w:r>
       <w:r>
         <w:rPr>
@@ -26704,6 +26739,50 @@
         <w:t xml:space="preserve">wallet_code</w:t>
       </w:r>
       <w:r>
+        <w:t xml:space="preserve"> </w:t>
+      </w:r>
+      <w:r>
+        <w:t xml:space="preserve">→ MAIN/VOICE/LOYALTY) are the Catalog-owned</w:t>
+      </w:r>
+      <w:r>
+        <w:t xml:space="preserve"> </w:t>
+      </w:r>
+      <w:r>
+        <w:rPr>
+          <w:rStyle w:val="VerbatimChar"/>
+        </w:rPr>
+        <w:t xml:space="preserve">wallet_type</w:t>
+      </w:r>
+      <w:r>
+        <w:t xml:space="preserve"> </w:t>
+      </w:r>
+      <w:r>
+        <w:t xml:space="preserve">catalog — see</w:t>
+      </w:r>
+      <w:r>
+        <w:t xml:space="preserve"> </w:t>
+      </w:r>
+      <w:hyperlink r:id="rId54">
+        <w:r>
+          <w:rPr>
+            <w:rStyle w:val="VerbatimChar"/>
+          </w:rPr>
+          <w:t xml:space="preserve">catalog.md</w:t>
+        </w:r>
+      </w:hyperlink>
+      <w:r>
+        <w:t xml:space="preserve">. The multiwallet migration added</w:t>
+      </w:r>
+      <w:r>
+        <w:t xml:space="preserve"> </w:t>
+      </w:r>
+      <w:r>
+        <w:rPr>
+          <w:rStyle w:val="VerbatimChar"/>
+        </w:rPr>
+        <w:t xml:space="preserve">wallet_code</w:t>
+      </w:r>
+      <w:r>
         <w:t xml:space="preserve">/</w:t>
       </w:r>
       <w:r>
@@ -26716,7 +26795,13 @@
         <w:t xml:space="preserve"> </w:t>
       </w:r>
       <w:r>
-        <w:t xml:space="preserve">and re-keyed uniqueness to</w:t>
+        <w:t xml:space="preserve">and re-keyed</w:t>
+      </w:r>
+      <w:r>
+        <w:t xml:space="preserve"> </w:t>
+      </w:r>
+      <w:r>
+        <w:t xml:space="preserve">uniqueness to</w:t>
       </w:r>
       <w:r>
         <w:t xml:space="preserve"> </w:t>
@@ -26740,13 +26825,13 @@
         <w:t xml:space="preserve">expires_at</w:t>
       </w:r>
       <w:r>
-        <w:t xml:space="preserve">. (The routing key is the</w:t>
-      </w:r>
-      <w:r>
-        <w:t xml:space="preserve"> </w:t>
-      </w:r>
-      <w:r>
-        <w:t xml:space="preserve">catalog</w:t>
+        <w:t xml:space="preserve">. (The routing</w:t>
+      </w:r>
+      <w:r>
+        <w:t xml:space="preserve"> </w:t>
+      </w:r>
+      <w:r>
+        <w:t xml:space="preserve">key is the catalog</w:t>
       </w:r>
       <w:r>
         <w:t xml:space="preserve"> </w:t>
@@ -28607,18 +28692,18 @@
           <wp:inline>
             <wp:extent cx="5334000" cy="4787816"/>
             <wp:effectExtent b="0" l="0" r="0" t="0"/>
-            <wp:docPr descr="diagram" title="" id="55" name="Picture"/>
+            <wp:docPr descr="diagram" title="" id="56" name="Picture"/>
             <a:graphic>
               <a:graphicData uri="http://schemas.openxmlformats.org/drawingml/2006/picture">
                 <pic:pic>
                   <pic:nvPicPr>
-                    <pic:cNvPr descr="/tmp/docximg-AYCofU/billing_md_6.png" id="56" name="Picture"/>
+                    <pic:cNvPr descr="/tmp/docximg-o5MXdY/billing_md_6.png" id="57" name="Picture"/>
                     <pic:cNvPicPr>
                       <a:picLocks noChangeArrowheads="1" noChangeAspect="1"/>
                     </pic:cNvPicPr>
                   </pic:nvPicPr>
                   <pic:blipFill>
-                    <a:blip r:embed="rId54"/>
+                    <a:blip r:embed="rId55"/>
                     <a:stretch>
                       <a:fillRect/>
                     </a:stretch>
@@ -28645,8 +28730,8 @@
         </w:drawing>
       </w:r>
     </w:p>
-    <w:bookmarkEnd w:id="57"/>
-    <w:bookmarkStart w:id="58" w:name="X4e8833918a7879cebc852a9820d21584079b9af"/>
+    <w:bookmarkEnd w:id="58"/>
+    <w:bookmarkStart w:id="59" w:name="X4e8833918a7879cebc852a9820d21584079b9af"/>
     <w:p>
       <w:pPr>
         <w:pStyle w:val="Heading3"/>
@@ -30545,8 +30630,8 @@
         <w:t xml:space="preserve">below.</w:t>
       </w:r>
     </w:p>
-    <w:bookmarkEnd w:id="58"/>
-    <w:bookmarkStart w:id="59" w:name="X50dc2d5735c56a5fb4994d28b3da26c174ca3e5"/>
+    <w:bookmarkEnd w:id="59"/>
+    <w:bookmarkStart w:id="60" w:name="X50dc2d5735c56a5fb4994d28b3da26c174ca3e5"/>
     <w:p>
       <w:pPr>
         <w:pStyle w:val="Heading3"/>
@@ -32666,9 +32751,9 @@
         <w:t xml:space="preserve">(one row per account).</w:t>
       </w:r>
     </w:p>
-    <w:bookmarkEnd w:id="59"/>
     <w:bookmarkEnd w:id="60"/>
-    <w:bookmarkStart w:id="61" w:name="X639aedc2ccd8044b7a70104ab90e84f8470c63d"/>
+    <w:bookmarkEnd w:id="61"/>
+    <w:bookmarkStart w:id="62" w:name="X639aedc2ccd8044b7a70104ab90e84f8470c63d"/>
     <w:p>
       <w:pPr>
         <w:pStyle w:val="Heading2"/>
@@ -33088,8 +33173,8 @@
         </w:tc>
       </w:tr>
     </w:tbl>
-    <w:bookmarkEnd w:id="61"/>
-    <w:bookmarkStart w:id="62" w:name="X3fad86b3f9f01f0516f0b94f23ef916d90447be"/>
+    <w:bookmarkEnd w:id="62"/>
+    <w:bookmarkStart w:id="63" w:name="X3fad86b3f9f01f0516f0b94f23ef916d90447be"/>
     <w:p>
       <w:pPr>
         <w:pStyle w:val="Heading2"/>
@@ -33263,8 +33348,8 @@
         <w:t xml:space="preserve">posting idempotent (gateway_ref or Idempotency-Key).</w:t>
       </w:r>
     </w:p>
-    <w:bookmarkEnd w:id="62"/>
-    <w:bookmarkStart w:id="63" w:name="X7bc46283b326661abf857675984e712cd2fa7f0"/>
+    <w:bookmarkEnd w:id="63"/>
+    <w:bookmarkStart w:id="64" w:name="X7bc46283b326661abf857675984e712cd2fa7f0"/>
     <w:p>
       <w:pPr>
         <w:pStyle w:val="Heading2"/>
@@ -33479,8 +33564,8 @@
         <w:t xml:space="preserve">.</w:t>
       </w:r>
     </w:p>
-    <w:bookmarkEnd w:id="63"/>
-    <w:bookmarkStart w:id="64" w:name="X07a0d9e9a1cefa6fc86daba300321a8ec711353"/>
+    <w:bookmarkEnd w:id="64"/>
+    <w:bookmarkStart w:id="65" w:name="X07a0d9e9a1cefa6fc86daba300321a8ec711353"/>
     <w:p>
       <w:pPr>
         <w:pStyle w:val="Heading2"/>
@@ -33596,8 +33681,8 @@
         <w:t xml:space="preserve">. The money heartbeat.</w:t>
       </w:r>
     </w:p>
-    <w:bookmarkEnd w:id="64"/>
-    <w:bookmarkStart w:id="65" w:name="X1bf2a627be6ee103cb059e15364eccb4d059631"/>
+    <w:bookmarkEnd w:id="65"/>
+    <w:bookmarkStart w:id="66" w:name="X1bf2a627be6ee103cb059e15364eccb4d059631"/>
     <w:p>
       <w:pPr>
         <w:pStyle w:val="Heading2"/>
@@ -33671,8 +33756,8 @@
         <w:t xml:space="preserve">.</w:t>
       </w:r>
     </w:p>
-    <w:bookmarkEnd w:id="65"/>
-    <w:bookmarkStart w:id="66" w:name="X63a8d27571a07c76bbbdc15cf677d35be107ee2"/>
+    <w:bookmarkEnd w:id="66"/>
+    <w:bookmarkStart w:id="67" w:name="X63a8d27571a07c76bbbdc15cf677d35be107ee2"/>
     <w:p>
       <w:pPr>
         <w:pStyle w:val="Heading2"/>
@@ -33789,8 +33874,8 @@
         <w:t xml:space="preserve">Subscription lifecycle, Payment events.</w:t>
       </w:r>
     </w:p>
-    <w:bookmarkEnd w:id="66"/>
-    <w:bookmarkStart w:id="67" w:name="Xcb40a318d67ac43889cfb87b8882350a4df3626"/>
+    <w:bookmarkEnd w:id="67"/>
+    <w:bookmarkStart w:id="68" w:name="Xcb40a318d67ac43889cfb87b8882350a4df3626"/>
     <w:p>
       <w:pPr>
         <w:pStyle w:val="Heading2"/>
@@ -34176,8 +34261,8 @@
         </w:tc>
       </w:tr>
     </w:tbl>
-    <w:bookmarkEnd w:id="67"/>
-    <w:bookmarkStart w:id="68" w:name="X1a2c77c63e8658ad1f03ac43a2a805296ed69e9"/>
+    <w:bookmarkEnd w:id="68"/>
+    <w:bookmarkStart w:id="69" w:name="X1a2c77c63e8658ad1f03ac43a2a805296ed69e9"/>
     <w:p>
       <w:pPr>
         <w:pStyle w:val="Heading2"/>
@@ -34326,8 +34411,8 @@
         <w:t xml:space="preserve">.</w:t>
       </w:r>
     </w:p>
-    <w:bookmarkEnd w:id="68"/>
     <w:bookmarkEnd w:id="69"/>
+    <w:bookmarkEnd w:id="70"/>
     <w:sectPr/>
   </w:body>
 </w:document>

</xml_diff>

<commit_message>
docs(as-built): regenerate rendered + docx mirrors for ops-console updates
Rebuilds the GitHub-mobile-readable rendered/ markdown and the docx/
exports for the 17 module guides whose "Processes & ops console" sections
were updated. Text-only change — no diagrams added, so diagram PNGs are
unchanged.

Co-Authored-By: Claude Opus 4.8 <noreply@anthropic.com>
Claude-Session: https://claude.ai/code/session_01RwtMRFwzHC7G5CTnGLhgKu
</commit_message>
<xml_diff>
--- a/docs/as-built/docx/billing.docx
+++ b/docs/as-built/docx/billing.docx
@@ -999,7 +999,7 @@
               <a:graphicData uri="http://schemas.openxmlformats.org/drawingml/2006/picture">
                 <pic:pic>
                   <pic:nvPicPr>
-                    <pic:cNvPr descr="/tmp/docximg-o5MXdY/billing_md_1.png" id="23" name="Picture"/>
+                    <pic:cNvPr descr="/tmp/docximg-d8ZS2x/billing_md_1.png" id="23" name="Picture"/>
                     <pic:cNvPicPr>
                       <a:picLocks noChangeArrowheads="1" noChangeAspect="1"/>
                     </pic:cNvPicPr>
@@ -1562,7 +1562,7 @@
               <a:graphicData uri="http://schemas.openxmlformats.org/drawingml/2006/picture">
                 <pic:pic>
                   <pic:nvPicPr>
-                    <pic:cNvPr descr="/tmp/docximg-o5MXdY/billing_md_2.png" id="28" name="Picture"/>
+                    <pic:cNvPr descr="/tmp/docximg-d8ZS2x/billing_md_2.png" id="28" name="Picture"/>
                     <pic:cNvPicPr>
                       <a:picLocks noChangeArrowheads="1" noChangeAspect="1"/>
                     </pic:cNvPicPr>
@@ -2008,13 +2008,29 @@
         <w:t xml:space="preserve"> </w:t>
       </w:r>
       <w:r>
-        <w:t xml:space="preserve">off (and the proposer can't approve their own). Once enough people sign, Billing issues a credit note</w:t>
-      </w:r>
-      <w:r>
-        <w:t xml:space="preserve"> </w:t>
-      </w:r>
-      <w:r>
-        <w:t xml:space="preserve">and applies it.</w:t>
+        <w:t xml:space="preserve">off — and when more than one is required, they must be</w:t>
+      </w:r>
+      <w:r>
+        <w:t xml:space="preserve"> </w:t>
+      </w:r>
+      <w:r>
+        <w:rPr>
+          <w:bCs/>
+          <w:b/>
+        </w:rPr>
+        <w:t xml:space="preserve">different people</w:t>
+      </w:r>
+      <w:r>
+        <w:t xml:space="preserve"> </w:t>
+      </w:r>
+      <w:r>
+        <w:t xml:space="preserve">(one person can't sign a</w:t>
+      </w:r>
+      <w:r>
+        <w:t xml:space="preserve"> </w:t>
+      </w:r>
+      <w:r>
+        <w:t xml:space="preserve">dual-control twice). Once enough distinct people sign, Billing issues a credit note and applies it.</w:t>
       </w:r>
     </w:p>
     <w:p>
@@ -2086,19 +2102,47 @@
         <w:pStyle w:val="Compact"/>
       </w:pPr>
       <w:r>
-        <w:t xml:space="preserve">If &gt;0 ⇒</w:t>
-      </w:r>
-      <w:r>
-        <w:t xml:space="preserve"> </w:t>
-      </w:r>
-      <w:r>
-        <w:rPr>
-          <w:rStyle w:val="VerbatimChar"/>
-        </w:rPr>
-        <w:t xml:space="preserve">adjustment_request.status=PENDING_APPROVAL</w:t>
-      </w:r>
-      <w:r>
-        <w:t xml:space="preserve">.</w:t>
+        <w:t xml:space="preserve">If &gt;0 ⇒ the proposal opens an</w:t>
+      </w:r>
+      <w:r>
+        <w:t xml:space="preserve"> </w:t>
+      </w:r>
+      <w:r>
+        <w:rPr>
+          <w:bCs/>
+          <w:b/>
+        </w:rPr>
+        <w:t xml:space="preserve">EM-CFG-04 gate</w:t>
+      </w:r>
+      <w:r>
+        <w:t xml:space="preserve"> </w:t>
+      </w:r>
+      <w:r>
+        <w:t xml:space="preserve">(a single stage with quorum =</w:t>
+      </w:r>
+      <w:r>
+        <w:t xml:space="preserve"> </w:t>
+      </w:r>
+      <w:r>
+        <w:rPr>
+          <w:rStyle w:val="VerbatimChar"/>
+        </w:rPr>
+        <w:t xml:space="preserve">stepsRequired</w:t>
+      </w:r>
+      <w:r>
+        <w:t xml:space="preserve">) and sits</w:t>
+      </w:r>
+      <w:r>
+        <w:t xml:space="preserve"> </w:t>
+      </w:r>
+      <w:r>
+        <w:rPr>
+          <w:rStyle w:val="VerbatimChar"/>
+        </w:rPr>
+        <w:t xml:space="preserve">PENDING_APPROVAL</w:t>
+      </w:r>
+      <w:r>
+        <w:t xml:space="preserve">. The N approval steps run on the same platform-wide approval engine as everything else — not a bespoke counter.</w:t>
       </w:r>
     </w:p>
     <w:p>
@@ -2110,7 +2154,23 @@
         <w:pStyle w:val="Compact"/>
       </w:pPr>
       <w:r>
-        <w:t xml:space="preserve">Approvers sign steps (separation of duties); when the count is met →</w:t>
+        <w:t xml:space="preserve">Approvers sign through the engine, which enforces</w:t>
+      </w:r>
+      <w:r>
+        <w:t xml:space="preserve"> </w:t>
+      </w:r>
+      <w:r>
+        <w:rPr>
+          <w:bCs/>
+          <w:b/>
+        </w:rPr>
+        <w:t xml:space="preserve">distinct approvers</w:t>
+      </w:r>
+      <w:r>
+        <w:t xml:space="preserve"> </w:t>
+      </w:r>
+      <w:r>
+        <w:t xml:space="preserve">(one person cannot satisfy a dual-control alone — a second sign by the same person is refused). When the quorum is met →</w:t>
       </w:r>
       <w:r>
         <w:t xml:space="preserve"> </w:t>
@@ -2140,7 +2200,22 @@
         <w:t xml:space="preserve"> </w:t>
       </w:r>
       <w:r>
-        <w:t xml:space="preserve">invoice (GEN-01) and applies it (CN-01).</w:t>
+        <w:t xml:space="preserve">invoice (GEN-01) and applies it (CN-01). The</w:t>
+      </w:r>
+      <w:r>
+        <w:t xml:space="preserve"> </w:t>
+      </w:r>
+      <w:r>
+        <w:rPr>
+          <w:rStyle w:val="VerbatimChar"/>
+        </w:rPr>
+        <w:t xml:space="preserve">adjustment_approval_step</w:t>
+      </w:r>
+      <w:r>
+        <w:t xml:space="preserve"> </w:t>
+      </w:r>
+      <w:r>
+        <w:t xml:space="preserve">rows stay as the readable adjustment audit (and carry the non-approval events: limit override, revision, auto-approve).</w:t>
       </w:r>
     </w:p>
     <w:p>
@@ -2157,7 +2232,7 @@
               <a:graphicData uri="http://schemas.openxmlformats.org/drawingml/2006/picture">
                 <pic:pic>
                   <pic:nvPicPr>
-                    <pic:cNvPr descr="/tmp/docximg-o5MXdY/billing_md_3.png" id="34" name="Picture"/>
+                    <pic:cNvPr descr="/tmp/docximg-d8ZS2x/billing_md_3.png" id="34" name="Picture"/>
                     <pic:cNvPicPr>
                       <a:picLocks noChangeArrowheads="1" noChangeAspect="1"/>
                     </pic:cNvPicPr>
@@ -6083,7 +6158,7 @@
               <a:graphicData uri="http://schemas.openxmlformats.org/drawingml/2006/picture">
                 <pic:pic>
                   <pic:nvPicPr>
-                    <pic:cNvPr descr="/tmp/docximg-o5MXdY/billing_md_4.png" id="42" name="Picture"/>
+                    <pic:cNvPr descr="/tmp/docximg-d8ZS2x/billing_md_4.png" id="42" name="Picture"/>
                     <pic:cNvPicPr>
                       <a:picLocks noChangeArrowheads="1" noChangeAspect="1"/>
                     </pic:cNvPicPr>
@@ -22534,7 +22609,7 @@
               <a:graphicData uri="http://schemas.openxmlformats.org/drawingml/2006/picture">
                 <pic:pic>
                   <pic:nvPicPr>
-                    <pic:cNvPr descr="/tmp/docximg-o5MXdY/billing_md_5.png" id="51" name="Picture"/>
+                    <pic:cNvPr descr="/tmp/docximg-d8ZS2x/billing_md_5.png" id="51" name="Picture"/>
                     <pic:cNvPicPr>
                       <a:picLocks noChangeArrowheads="1" noChangeAspect="1"/>
                     </pic:cNvPicPr>
@@ -25989,7 +26064,23 @@
         <w:t xml:space="preserve"> </w:t>
       </w:r>
       <w:r>
-        <w:t xml:space="preserve">(distinct approvers, not the proposer).</w:t>
+        <w:t xml:space="preserve">(the EM-CFG-04 gate's quorum — that many</w:t>
+      </w:r>
+      <w:r>
+        <w:t xml:space="preserve"> </w:t>
+      </w:r>
+      <w:r>
+        <w:rPr>
+          <w:iCs/>
+          <w:i/>
+        </w:rPr>
+        <w:t xml:space="preserve">distinct</w:t>
+      </w:r>
+      <w:r>
+        <w:t xml:space="preserve"> </w:t>
+      </w:r>
+      <w:r>
+        <w:t xml:space="preserve">approvers; one person can't sign twice).</w:t>
       </w:r>
     </w:p>
     <w:p>
@@ -26165,7 +26256,13 @@
         <w:t xml:space="preserve"> </w:t>
       </w:r>
       <w:r>
-        <w:t xml:space="preserve">count; the request only applies once that many</w:t>
+        <w:t xml:space="preserve">count; that becomes the EM-CFG-04 gate's quorum, and the request only applies once</w:t>
+      </w:r>
+      <w:r>
+        <w:t xml:space="preserve"> </w:t>
+      </w:r>
+      <w:r>
+        <w:t xml:space="preserve">that many</w:t>
       </w:r>
       <w:r>
         <w:t xml:space="preserve"> </w:t>
@@ -26181,13 +26278,7 @@
         <w:t xml:space="preserve"> </w:t>
       </w:r>
       <w:r>
-        <w:t xml:space="preserve">approvers (not the</w:t>
-      </w:r>
-      <w:r>
-        <w:t xml:space="preserve"> </w:t>
-      </w:r>
-      <w:r>
-        <w:t xml:space="preserve">proposer) have signed:</w:t>
+        <w:t xml:space="preserve">approvers have signed (the engine refuses a second sign by the same person):</w:t>
       </w:r>
     </w:p>
     <w:tbl>
@@ -28697,7 +28788,7 @@
               <a:graphicData uri="http://schemas.openxmlformats.org/drawingml/2006/picture">
                 <pic:pic>
                   <pic:nvPicPr>
-                    <pic:cNvPr descr="/tmp/docximg-o5MXdY/billing_md_6.png" id="57" name="Picture"/>
+                    <pic:cNvPr descr="/tmp/docximg-d8ZS2x/billing_md_6.png" id="57" name="Picture"/>
                     <pic:cNvPicPr>
                       <a:picLocks noChangeArrowheads="1" noChangeAspect="1"/>
                     </pic:cNvPicPr>
@@ -33565,13 +33656,13 @@
       </w:r>
     </w:p>
     <w:bookmarkEnd w:id="64"/>
-    <w:bookmarkStart w:id="65" w:name="X07a0d9e9a1cefa6fc86daba300321a8ec711353"/>
+    <w:bookmarkStart w:id="65" w:name="Xbdb564fcab6f6f71ef61f22280b7304c50ca780"/>
     <w:p>
       <w:pPr>
         <w:pStyle w:val="Heading2"/>
       </w:pPr>
       <w:r>
-        <w:t xml:space="preserve">6. Processes (scheduled workers)</w:t>
+        <w:t xml:space="preserve">6. Processes &amp; ops console</w:t>
       </w:r>
     </w:p>
     <w:p>
@@ -33580,6 +33671,31 @@
       </w:pPr>
       <w:r>
         <w:rPr>
+          <w:bCs/>
+          <w:b/>
+        </w:rPr>
+        <w:t xml:space="preserve">Scheduled workers</w:t>
+      </w:r>
+      <w:r>
+        <w:t xml:space="preserve"> </w:t>
+      </w:r>
+      <w:r>
+        <w:t xml:space="preserve">(</w:t>
+      </w:r>
+      <w:r>
+        <w:rPr>
+          <w:rStyle w:val="VerbatimChar"/>
+        </w:rPr>
+        <w:t xml:space="preserve">routes/console.php</w:t>
+      </w:r>
+      <w:r>
+        <w:t xml:space="preserve">):</w:t>
+      </w:r>
+      <w:r>
+        <w:t xml:space="preserve"> </w:t>
+      </w:r>
+      <w:r>
+        <w:rPr>
           <w:rStyle w:val="VerbatimChar"/>
         </w:rPr>
         <w:t xml:space="preserve">cycle-close</w:t>
@@ -33597,16 +33713,25 @@
         <w:rPr>
           <w:rStyle w:val="VerbatimChar"/>
         </w:rPr>
+        <w:t xml:space="preserve">generation-retry</w:t>
+      </w:r>
+      <w:r>
+        <w:t xml:space="preserve"> </w:t>
+      </w:r>
+      <w:r>
+        <w:t xml:space="preserve">(15m),</w:t>
+      </w:r>
+      <w:r>
+        <w:t xml:space="preserve"> </w:t>
+      </w:r>
+      <w:r>
+        <w:rPr>
+          <w:rStyle w:val="VerbatimChar"/>
+        </w:rPr>
         <w:t xml:space="preserve">dunning-run</w:t>
       </w:r>
       <w:r>
-        <w:t xml:space="preserve"> </w:t>
-      </w:r>
-      <w:r>
-        <w:t xml:space="preserve">(daily),</w:t>
-      </w:r>
-      <w:r>
-        <w:t xml:space="preserve"> </w:t>
+        <w:t xml:space="preserve">/</w:t>
       </w:r>
       <w:r>
         <w:rPr>
@@ -33615,28 +33740,7 @@
         <w:t xml:space="preserve">pro-forma</w:t>
       </w:r>
       <w:r>
-        <w:t xml:space="preserve"> </w:t>
-      </w:r>
-      <w:r>
-        <w:t xml:space="preserve">(daily),</w:t>
-      </w:r>
-      <w:r>
-        <w:t xml:space="preserve"> </w:t>
-      </w:r>
-      <w:r>
-        <w:rPr>
-          <w:rStyle w:val="VerbatimChar"/>
-        </w:rPr>
-        <w:t xml:space="preserve">generation-retry</w:t>
-      </w:r>
-      <w:r>
-        <w:t xml:space="preserve"> </w:t>
-      </w:r>
-      <w:r>
-        <w:t xml:space="preserve">(15m),</w:t>
-      </w:r>
-      <w:r>
-        <w:t xml:space="preserve"> </w:t>
+        <w:t xml:space="preserve">/</w:t>
       </w:r>
       <w:r>
         <w:rPr>
@@ -33645,6 +33749,33 @@
         <w:t xml:space="preserve">wallet:expire</w:t>
       </w:r>
       <w:r>
+        <w:t xml:space="preserve"> </w:t>
+      </w:r>
+      <w:r>
+        <w:t xml:space="preserve">(daily); on-demand:</w:t>
+      </w:r>
+      <w:r>
+        <w:t xml:space="preserve"> </w:t>
+      </w:r>
+      <w:r>
+        <w:rPr>
+          <w:rStyle w:val="VerbatimChar"/>
+        </w:rPr>
+        <w:t xml:space="preserve">run-cycle</w:t>
+      </w:r>
+      <w:r>
+        <w:t xml:space="preserve">,</w:t>
+      </w:r>
+      <w:r>
+        <w:t xml:space="preserve"> </w:t>
+      </w:r>
+      <w:r>
+        <w:rPr>
+          <w:rStyle w:val="VerbatimChar"/>
+        </w:rPr>
+        <w:t xml:space="preserve">rate-usage</w:t>
+      </w:r>
+      <w:r>
         <w:t xml:space="preserve">,</w:t>
       </w:r>
       <w:r>
@@ -33675,213 +33806,40 @@
         <w:rPr>
           <w:rStyle w:val="VerbatimChar"/>
         </w:rPr>
-        <w:t xml:space="preserve">rate-usage</w:t>
+        <w:t xml:space="preserve">dunning-archive</w:t>
       </w:r>
       <w:r>
         <w:t xml:space="preserve">. The money heartbeat.</w:t>
-      </w:r>
-    </w:p>
-    <w:bookmarkEnd w:id="65"/>
-    <w:bookmarkStart w:id="66" w:name="X1bf2a627be6ee103cb059e15364eccb4d059631"/>
-    <w:p>
-      <w:pPr>
-        <w:pStyle w:val="Heading2"/>
-      </w:pPr>
-      <w:r>
-        <w:t xml:space="preserve">7. Policy &amp; config</w:t>
       </w:r>
     </w:p>
     <w:p>
       <w:pPr>
-        <w:pStyle w:val="FirstParagraph"/>
-      </w:pPr>
-      <w:r>
-        <w:rPr>
-          <w:rStyle w:val="VerbatimChar"/>
-        </w:rPr>
-        <w:t xml:space="preserve">rules.billing.adjustment-approval</w:t>
-      </w:r>
-      <w:r>
-        <w:t xml:space="preserve">;</w:t>
-      </w:r>
-      <w:r>
-        <w:t xml:space="preserve"> </w:t>
-      </w:r>
-      <w:r>
-        <w:rPr>
-          <w:rStyle w:val="VerbatimChar"/>
-        </w:rPr>
-        <w:t xml:space="preserve">billable_event</w:t>
-      </w:r>
-      <w:r>
-        <w:t xml:space="preserve"> </w:t>
-      </w:r>
-      <w:r>
-        <w:t xml:space="preserve">catalog; versioned</w:t>
-      </w:r>
-      <w:r>
-        <w:t xml:space="preserve"> </w:t>
-      </w:r>
-      <w:r>
-        <w:rPr>
-          <w:rStyle w:val="VerbatimChar"/>
-        </w:rPr>
-        <w:t xml:space="preserve">dunning_program</w:t>
-      </w:r>
-      <w:r>
-        <w:t xml:space="preserve">;</w:t>
-      </w:r>
-      <w:r>
-        <w:t xml:space="preserve"> </w:t>
-      </w:r>
-      <w:r>
-        <w:rPr>
-          <w:rStyle w:val="VerbatimChar"/>
-        </w:rPr>
-        <w:t xml:space="preserve">adjustment_reason_code</w:t>
-      </w:r>
-      <w:r>
-        <w:t xml:space="preserve">/limits; tax via Catalog; cycle cadence on the sub; invoice</w:t>
-      </w:r>
-      <w:r>
-        <w:t xml:space="preserve"> </w:t>
-      </w:r>
-      <w:r>
-        <w:rPr>
-          <w:rStyle w:val="VerbatimChar"/>
-        </w:rPr>
-        <w:t xml:space="preserve">grouping_dimension</w:t>
-      </w:r>
-      <w:r>
-        <w:t xml:space="preserve">.</w:t>
-      </w:r>
-    </w:p>
-    <w:bookmarkEnd w:id="66"/>
-    <w:bookmarkStart w:id="67" w:name="X63a8d27571a07c76bbbdc15cf677d35be107ee2"/>
-    <w:p>
-      <w:pPr>
-        <w:pStyle w:val="Heading2"/>
-      </w:pPr>
-      <w:r>
-        <w:t xml:space="preserve">8. Cross-module dependencies</w:t>
-      </w:r>
-    </w:p>
-    <w:p>
-      <w:pPr>
-        <w:numPr>
-          <w:ilvl w:val="0"/>
-          <w:numId w:val="1016"/>
-        </w:numPr>
-        <w:pStyle w:val="Compact"/>
+        <w:pStyle w:val="BodyText"/>
       </w:pPr>
       <w:r>
         <w:rPr>
           <w:bCs/>
           <w:b/>
         </w:rPr>
-        <w:t xml:space="preserve">Reads →</w:t>
-      </w:r>
-      <w:r>
-        <w:t xml:space="preserve"> </w:t>
-      </w:r>
-      <w:r>
-        <w:t xml:space="preserve">Catalog (</w:t>
-      </w:r>
-      <w:r>
-        <w:rPr>
-          <w:rStyle w:val="VerbatimChar"/>
-        </w:rPr>
-        <w:t xml:space="preserve">package</w:t>
-      </w:r>
-      <w:r>
-        <w:t xml:space="preserve">/</w:t>
-      </w:r>
-      <w:r>
-        <w:rPr>
-          <w:rStyle w:val="VerbatimChar"/>
-        </w:rPr>
-        <w:t xml:space="preserve">service</w:t>
-      </w:r>
-      <w:r>
-        <w:t xml:space="preserve"> </w:t>
-      </w:r>
-      <w:r>
-        <w:t xml:space="preserve">charges,</w:t>
-      </w:r>
-      <w:r>
-        <w:t xml:space="preserve"> </w:t>
-      </w:r>
-      <w:r>
-        <w:rPr>
-          <w:rStyle w:val="VerbatimChar"/>
-        </w:rPr>
-        <w:t xml:space="preserve">TaxComputeService</w:t>
-      </w:r>
-      <w:r>
-        <w:t xml:space="preserve">, discount engine).</w:t>
-      </w:r>
-    </w:p>
-    <w:p>
-      <w:pPr>
-        <w:numPr>
-          <w:ilvl w:val="0"/>
-          <w:numId w:val="1016"/>
-        </w:numPr>
-        <w:pStyle w:val="Compact"/>
-      </w:pPr>
-      <w:r>
-        <w:rPr>
-          <w:bCs/>
-          <w:b/>
-        </w:rPr>
-        <w:t xml:space="preserve">Drives →</w:t>
-      </w:r>
-      <w:r>
-        <w:t xml:space="preserve"> </w:t>
-      </w:r>
-      <w:r>
-        <w:t xml:space="preserve">Subscription (</w:t>
-      </w:r>
-      <w:r>
-        <w:rPr>
-          <w:rStyle w:val="VerbatimChar"/>
-        </w:rPr>
-        <w:t xml:space="preserve">state_callback</w:t>
-      </w:r>
-      <w:r>
-        <w:t xml:space="preserve">, dunning suspend/restrict), OSR (deposit forfeiture),</w:t>
-      </w:r>
-      <w:r>
-        <w:t xml:space="preserve"> </w:t>
-      </w:r>
-      <w:r>
-        <w:t xml:space="preserve">Notification (dunning/tax notices).</w:t>
-      </w:r>
-      <w:r>
-        <w:t xml:space="preserve"> </w:t>
-      </w:r>
-      <w:r>
-        <w:rPr>
-          <w:bCs/>
-          <w:b/>
-        </w:rPr>
-        <w:t xml:space="preserve">Reacts to →</w:t>
-      </w:r>
-      <w:r>
-        <w:t xml:space="preserve"> </w:t>
-      </w:r>
-      <w:r>
-        <w:t xml:space="preserve">Subscription lifecycle, Payment events.</w:t>
-      </w:r>
-    </w:p>
-    <w:bookmarkEnd w:id="67"/>
-    <w:bookmarkStart w:id="68" w:name="Xcb40a318d67ac43889cfb87b8882350a4df3626"/>
-    <w:p>
-      <w:pPr>
-        <w:pStyle w:val="Heading2"/>
-      </w:pPr>
-      <w:r>
-        <w:t xml:space="preserve">9. Invariants &amp; rules</w:t>
+        <w:t xml:space="preserve">Ops console</w:t>
+      </w:r>
+      <w:r>
+        <w:t xml:space="preserve"> </w:t>
+      </w:r>
+      <w:r>
+        <w:t xml:space="preserve">—</w:t>
+      </w:r>
+      <w:r>
+        <w:t xml:space="preserve"> </w:t>
+      </w:r>
+      <w:r>
+        <w:rPr>
+          <w:rStyle w:val="VerbatimChar"/>
+        </w:rPr>
+        <w:t xml:space="preserve">sophix:billing:*</w:t>
+      </w:r>
+      <w:r>
+        <w:t xml:space="preserve">, wrapping existing services (no approval-gate bypass):</w:t>
       </w:r>
     </w:p>
     <w:tbl>
@@ -33908,7 +33866,7 @@
               <w:jc w:val="left"/>
             </w:pPr>
             <w:r>
-              <w:t xml:space="preserve">Rule</w:t>
+              <w:t xml:space="preserve">Command</w:t>
             </w:r>
           </w:p>
         </w:tc>
@@ -33920,7 +33878,7 @@
               <w:jc w:val="left"/>
             </w:pPr>
             <w:r>
-              <w:t xml:space="preserve">Statement</w:t>
+              <w:t xml:space="preserve">Kind</w:t>
             </w:r>
           </w:p>
         </w:tc>
@@ -33932,7 +33890,7 @@
               <w:jc w:val="left"/>
             </w:pPr>
             <w:r>
-              <w:t xml:space="preserve">Enforced in</w:t>
+              <w:t xml:space="preserve">Does</w:t>
             </w:r>
           </w:p>
         </w:tc>
@@ -33946,7 +33904,10 @@
               <w:jc w:val="left"/>
             </w:pPr>
             <w:r>
-              <w:t xml:space="preserve">R-BIL-03-C-5</w:t>
+              <w:rPr>
+                <w:rStyle w:val="VerbatimChar"/>
+              </w:rPr>
+              <w:t xml:space="preserve">ops-status [--operator]</w:t>
             </w:r>
           </w:p>
         </w:tc>
@@ -33958,7 +33919,7 @@
               <w:jc w:val="left"/>
             </w:pPr>
             <w:r>
-              <w:t xml:space="preserve">a window closes at most once</w:t>
+              <w:t xml:space="preserve">review</w:t>
             </w:r>
           </w:p>
         </w:tc>
@@ -33970,10 +33931,7 @@
               <w:jc w:val="left"/>
             </w:pPr>
             <w:r>
-              <w:rPr>
-                <w:rStyle w:val="VerbatimChar"/>
-              </w:rPr>
-              <w:t xml:space="preserve">CycleCloseService::closeCycle</w:t>
+              <w:t xml:space="preserve">queue counts needing attention: overdue invoices, dunning review/recovery-failed, adjustments pending/failed, bulk reversals pending, tax signing-failed, generation-failure queue</w:t>
             </w:r>
           </w:p>
         </w:tc>
@@ -33987,7 +33945,10 @@
               <w:jc w:val="left"/>
             </w:pPr>
             <w:r>
-              <w:t xml:space="preserve">R-BIL-03-C-3/W-1</w:t>
+              <w:rPr>
+                <w:rStyle w:val="VerbatimChar"/>
+              </w:rPr>
+              <w:t xml:space="preserve">dunning-show {account}</w:t>
             </w:r>
           </w:p>
         </w:tc>
@@ -33999,7 +33960,7 @@
               <w:jc w:val="left"/>
             </w:pPr>
             <w:r>
-              <w:t xml:space="preserve">prepaid miss freezes anchor + dunning; unfreezes on top-up</w:t>
+              <w:t xml:space="preserve">review</w:t>
             </w:r>
           </w:p>
         </w:tc>
@@ -34011,22 +33972,7 @@
               <w:jc w:val="left"/>
             </w:pPr>
             <w:r>
-              <w:rPr>
-                <w:rStyle w:val="VerbatimChar"/>
-              </w:rPr>
-              <w:t xml:space="preserve">CycleCloseService</w:t>
-            </w:r>
-            <w:r>
-              <w:t xml:space="preserve">,</w:t>
-            </w:r>
-            <w:r>
-              <w:t xml:space="preserve"> </w:t>
-            </w:r>
-            <w:r>
-              <w:rPr>
-                <w:rStyle w:val="VerbatimChar"/>
-              </w:rPr>
-              <w:t xml:space="preserve">RetryFrozenCycleOnTopup</w:t>
+              <w:t xml:space="preserve">one account's dunning episode (level, status, debt, cadence, restrictions)</w:t>
             </w:r>
           </w:p>
         </w:tc>
@@ -34040,7 +33986,10 @@
               <w:jc w:val="left"/>
             </w:pPr>
             <w:r>
-              <w:t xml:space="preserve">R-BIL-04-C-1</w:t>
+              <w:rPr>
+                <w:rStyle w:val="VerbatimChar"/>
+              </w:rPr>
+              <w:t xml:space="preserve">dunning-fix {account} {action}</w:t>
             </w:r>
           </w:p>
         </w:tc>
@@ -34052,7 +34001,7 @@
               <w:jc w:val="left"/>
             </w:pPr>
             <w:r>
-              <w:t xml:space="preserve">dunning program version pinned at entry</w:t>
+              <w:t xml:space="preserve">safe-correction</w:t>
             </w:r>
           </w:p>
         </w:tc>
@@ -34064,10 +34013,447 @@
               <w:jc w:val="left"/>
             </w:pPr>
             <w:r>
+              <w:t xml:space="preserve">one dunning admin op —</w:t>
+            </w:r>
+            <w:r>
+              <w:t xml:space="preserve"> </w:t>
+            </w:r>
+            <w:r>
               <w:rPr>
                 <w:rStyle w:val="VerbatimChar"/>
               </w:rPr>
-              <w:t xml:space="preserve">DunningService</w:t>
+              <w:t xml:space="preserve">refresh-debt</w:t>
+            </w:r>
+            <w:r>
+              <w:t xml:space="preserve">/</w:t>
+            </w:r>
+            <w:r>
+              <w:rPr>
+                <w:rStyle w:val="VerbatimChar"/>
+              </w:rPr>
+              <w:t xml:space="preserve">clear</w:t>
+            </w:r>
+            <w:r>
+              <w:t xml:space="preserve">/</w:t>
+            </w:r>
+            <w:r>
+              <w:rPr>
+                <w:rStyle w:val="VerbatimChar"/>
+              </w:rPr>
+              <w:t xml:space="preserve">admin-clear</w:t>
+            </w:r>
+            <w:r>
+              <w:t xml:space="preserve">/</w:t>
+            </w:r>
+            <w:r>
+              <w:rPr>
+                <w:rStyle w:val="VerbatimChar"/>
+              </w:rPr>
+              <w:t xml:space="preserve">hold</w:t>
+            </w:r>
+            <w:r>
+              <w:t xml:space="preserve">/</w:t>
+            </w:r>
+            <w:r>
+              <w:rPr>
+                <w:rStyle w:val="VerbatimChar"/>
+              </w:rPr>
+              <w:t xml:space="preserve">advance</w:t>
+            </w:r>
+            <w:r>
+              <w:t xml:space="preserve">/</w:t>
+            </w:r>
+            <w:r>
+              <w:rPr>
+                <w:rStyle w:val="VerbatimChar"/>
+              </w:rPr>
+              <w:t xml:space="preserve">confirm-termination</w:t>
+            </w:r>
+            <w:r>
+              <w:t xml:space="preserve">/</w:t>
+            </w:r>
+            <w:r>
+              <w:rPr>
+                <w:rStyle w:val="VerbatimChar"/>
+              </w:rPr>
+              <w:t xml:space="preserve">force-terminate</w:t>
+            </w:r>
+            <w:r>
+              <w:t xml:space="preserve">/</w:t>
+            </w:r>
+            <w:r>
+              <w:rPr>
+                <w:rStyle w:val="VerbatimChar"/>
+              </w:rPr>
+              <w:t xml:space="preserve">extend-review</w:t>
+            </w:r>
+            <w:r>
+              <w:t xml:space="preserve">; destructive actions need</w:t>
+            </w:r>
+            <w:r>
+              <w:t xml:space="preserve"> </w:t>
+            </w:r>
+            <w:r>
+              <w:rPr>
+                <w:rStyle w:val="VerbatimChar"/>
+              </w:rPr>
+              <w:t xml:space="preserve">--confirm</w:t>
+            </w:r>
+          </w:p>
+        </w:tc>
+      </w:tr>
+    </w:tbl>
+    <w:p>
+      <w:pPr>
+        <w:pStyle w:val="BodyText"/>
+      </w:pPr>
+      <w:r>
+        <w:rPr>
+          <w:iCs/>
+          <w:i/>
+        </w:rPr>
+        <w:t xml:space="preserve">If we have a</w:t>
+      </w:r>
+      <w:r>
+        <w:rPr>
+          <w:iCs/>
+          <w:i/>
+        </w:rPr>
+        <w:t xml:space="preserve"> </w:t>
+      </w:r>
+      <w:r>
+        <w:rPr>
+          <w:rStyle w:val="VerbatimChar"/>
+          <w:iCs/>
+          <w:i/>
+        </w:rPr>
+        <w:t xml:space="preserve">PENDING_TERMINATION_REVIEW</w:t>
+      </w:r>
+      <w:r>
+        <w:rPr>
+          <w:iCs/>
+          <w:i/>
+        </w:rPr>
+        <w:t xml:space="preserve"> </w:t>
+      </w:r>
+      <w:r>
+        <w:rPr>
+          <w:iCs/>
+          <w:i/>
+        </w:rPr>
+        <w:t xml:space="preserve">row,</w:t>
+      </w:r>
+      <w:r>
+        <w:rPr>
+          <w:iCs/>
+          <w:i/>
+        </w:rPr>
+        <w:t xml:space="preserve"> </w:t>
+      </w:r>
+      <w:r>
+        <w:rPr>
+          <w:rStyle w:val="VerbatimChar"/>
+          <w:iCs/>
+          <w:i/>
+        </w:rPr>
+        <w:t xml:space="preserve">ops-status</w:t>
+      </w:r>
+      <w:r>
+        <w:rPr>
+          <w:iCs/>
+          <w:i/>
+        </w:rPr>
+        <w:t xml:space="preserve"> </w:t>
+      </w:r>
+      <w:r>
+        <w:rPr>
+          <w:iCs/>
+          <w:i/>
+        </w:rPr>
+        <w:t xml:space="preserve">surfaces it and</w:t>
+      </w:r>
+      <w:r>
+        <w:rPr>
+          <w:iCs/>
+          <w:i/>
+        </w:rPr>
+        <w:t xml:space="preserve"> </w:t>
+      </w:r>
+      <w:r>
+        <w:rPr>
+          <w:rStyle w:val="VerbatimChar"/>
+          <w:iCs/>
+          <w:i/>
+        </w:rPr>
+        <w:t xml:space="preserve">dunning-fix … confirm-termination</w:t>
+      </w:r>
+      <w:r>
+        <w:rPr>
+          <w:iCs/>
+          <w:i/>
+        </w:rPr>
+        <w:t xml:space="preserve"> </w:t>
+      </w:r>
+      <w:r>
+        <w:rPr>
+          <w:iCs/>
+          <w:i/>
+        </w:rPr>
+        <w:t xml:space="preserve">clears it — no SQL, no approval bypass (dunning admin is ungated; EM-CFG-04 paths like adjustment/bulk-reversal approval are inspect-only from the CLI).</w:t>
+      </w:r>
+    </w:p>
+    <w:bookmarkEnd w:id="65"/>
+    <w:bookmarkStart w:id="66" w:name="X1bf2a627be6ee103cb059e15364eccb4d059631"/>
+    <w:p>
+      <w:pPr>
+        <w:pStyle w:val="Heading2"/>
+      </w:pPr>
+      <w:r>
+        <w:t xml:space="preserve">7. Policy &amp; config</w:t>
+      </w:r>
+    </w:p>
+    <w:p>
+      <w:pPr>
+        <w:pStyle w:val="FirstParagraph"/>
+      </w:pPr>
+      <w:r>
+        <w:rPr>
+          <w:rStyle w:val="VerbatimChar"/>
+        </w:rPr>
+        <w:t xml:space="preserve">rules.billing.adjustment-approval</w:t>
+      </w:r>
+      <w:r>
+        <w:t xml:space="preserve">;</w:t>
+      </w:r>
+      <w:r>
+        <w:t xml:space="preserve"> </w:t>
+      </w:r>
+      <w:r>
+        <w:rPr>
+          <w:rStyle w:val="VerbatimChar"/>
+        </w:rPr>
+        <w:t xml:space="preserve">billable_event</w:t>
+      </w:r>
+      <w:r>
+        <w:t xml:space="preserve"> </w:t>
+      </w:r>
+      <w:r>
+        <w:t xml:space="preserve">catalog; versioned</w:t>
+      </w:r>
+      <w:r>
+        <w:t xml:space="preserve"> </w:t>
+      </w:r>
+      <w:r>
+        <w:rPr>
+          <w:rStyle w:val="VerbatimChar"/>
+        </w:rPr>
+        <w:t xml:space="preserve">dunning_program</w:t>
+      </w:r>
+      <w:r>
+        <w:t xml:space="preserve">;</w:t>
+      </w:r>
+      <w:r>
+        <w:t xml:space="preserve"> </w:t>
+      </w:r>
+      <w:r>
+        <w:rPr>
+          <w:rStyle w:val="VerbatimChar"/>
+        </w:rPr>
+        <w:t xml:space="preserve">adjustment_reason_code</w:t>
+      </w:r>
+      <w:r>
+        <w:t xml:space="preserve">/limits; tax via Catalog; cycle cadence on the sub; invoice</w:t>
+      </w:r>
+      <w:r>
+        <w:t xml:space="preserve"> </w:t>
+      </w:r>
+      <w:r>
+        <w:rPr>
+          <w:rStyle w:val="VerbatimChar"/>
+        </w:rPr>
+        <w:t xml:space="preserve">grouping_dimension</w:t>
+      </w:r>
+      <w:r>
+        <w:t xml:space="preserve">.</w:t>
+      </w:r>
+    </w:p>
+    <w:bookmarkEnd w:id="66"/>
+    <w:bookmarkStart w:id="67" w:name="X63a8d27571a07c76bbbdc15cf677d35be107ee2"/>
+    <w:p>
+      <w:pPr>
+        <w:pStyle w:val="Heading2"/>
+      </w:pPr>
+      <w:r>
+        <w:t xml:space="preserve">8. Cross-module dependencies</w:t>
+      </w:r>
+    </w:p>
+    <w:p>
+      <w:pPr>
+        <w:numPr>
+          <w:ilvl w:val="0"/>
+          <w:numId w:val="1016"/>
+        </w:numPr>
+        <w:pStyle w:val="Compact"/>
+      </w:pPr>
+      <w:r>
+        <w:rPr>
+          <w:bCs/>
+          <w:b/>
+        </w:rPr>
+        <w:t xml:space="preserve">Reads →</w:t>
+      </w:r>
+      <w:r>
+        <w:t xml:space="preserve"> </w:t>
+      </w:r>
+      <w:r>
+        <w:t xml:space="preserve">Catalog (</w:t>
+      </w:r>
+      <w:r>
+        <w:rPr>
+          <w:rStyle w:val="VerbatimChar"/>
+        </w:rPr>
+        <w:t xml:space="preserve">package</w:t>
+      </w:r>
+      <w:r>
+        <w:t xml:space="preserve">/</w:t>
+      </w:r>
+      <w:r>
+        <w:rPr>
+          <w:rStyle w:val="VerbatimChar"/>
+        </w:rPr>
+        <w:t xml:space="preserve">service</w:t>
+      </w:r>
+      <w:r>
+        <w:t xml:space="preserve"> </w:t>
+      </w:r>
+      <w:r>
+        <w:t xml:space="preserve">charges,</w:t>
+      </w:r>
+      <w:r>
+        <w:t xml:space="preserve"> </w:t>
+      </w:r>
+      <w:r>
+        <w:rPr>
+          <w:rStyle w:val="VerbatimChar"/>
+        </w:rPr>
+        <w:t xml:space="preserve">TaxComputeService</w:t>
+      </w:r>
+      <w:r>
+        <w:t xml:space="preserve">, discount engine).</w:t>
+      </w:r>
+    </w:p>
+    <w:p>
+      <w:pPr>
+        <w:numPr>
+          <w:ilvl w:val="0"/>
+          <w:numId w:val="1016"/>
+        </w:numPr>
+        <w:pStyle w:val="Compact"/>
+      </w:pPr>
+      <w:r>
+        <w:rPr>
+          <w:bCs/>
+          <w:b/>
+        </w:rPr>
+        <w:t xml:space="preserve">Drives →</w:t>
+      </w:r>
+      <w:r>
+        <w:t xml:space="preserve"> </w:t>
+      </w:r>
+      <w:r>
+        <w:t xml:space="preserve">Subscription (</w:t>
+      </w:r>
+      <w:r>
+        <w:rPr>
+          <w:rStyle w:val="VerbatimChar"/>
+        </w:rPr>
+        <w:t xml:space="preserve">state_callback</w:t>
+      </w:r>
+      <w:r>
+        <w:t xml:space="preserve">, dunning suspend/restrict), OSR (deposit forfeiture),</w:t>
+      </w:r>
+      <w:r>
+        <w:t xml:space="preserve"> </w:t>
+      </w:r>
+      <w:r>
+        <w:t xml:space="preserve">Notification (dunning/tax notices).</w:t>
+      </w:r>
+      <w:r>
+        <w:t xml:space="preserve"> </w:t>
+      </w:r>
+      <w:r>
+        <w:rPr>
+          <w:bCs/>
+          <w:b/>
+        </w:rPr>
+        <w:t xml:space="preserve">Reacts to →</w:t>
+      </w:r>
+      <w:r>
+        <w:t xml:space="preserve"> </w:t>
+      </w:r>
+      <w:r>
+        <w:t xml:space="preserve">Subscription lifecycle, Payment events.</w:t>
+      </w:r>
+    </w:p>
+    <w:bookmarkEnd w:id="67"/>
+    <w:bookmarkStart w:id="68" w:name="Xcb40a318d67ac43889cfb87b8882350a4df3626"/>
+    <w:p>
+      <w:pPr>
+        <w:pStyle w:val="Heading2"/>
+      </w:pPr>
+      <w:r>
+        <w:t xml:space="preserve">9. Invariants &amp; rules</w:t>
+      </w:r>
+    </w:p>
+    <w:tbl>
+      <w:tblPr>
+        <w:tblStyle w:val="Table"/>
+        <w:tblW w:type="auto" w:w="0"/>
+        <w:tblLook w:firstRow="1" w:lastRow="0" w:firstColumn="0" w:lastColumn="0" w:noHBand="0" w:noVBand="0" w:val="0020"/>
+        <w:jc w:val="start"/>
+      </w:tblPr>
+      <w:tblGrid>
+        <w:gridCol w:w="2640"/>
+        <w:gridCol w:w="2640"/>
+        <w:gridCol w:w="2640"/>
+      </w:tblGrid>
+      <w:tr>
+        <w:trPr>
+          <w:tblHeader w:val="true"/>
+        </w:trPr>
+        <w:tc>
+          <w:tcPr/>
+          <w:p>
+            <w:pPr>
+              <w:pStyle w:val="Compact"/>
+              <w:jc w:val="left"/>
+            </w:pPr>
+            <w:r>
+              <w:t xml:space="preserve">Rule</w:t>
+            </w:r>
+          </w:p>
+        </w:tc>
+        <w:tc>
+          <w:tcPr/>
+          <w:p>
+            <w:pPr>
+              <w:pStyle w:val="Compact"/>
+              <w:jc w:val="left"/>
+            </w:pPr>
+            <w:r>
+              <w:t xml:space="preserve">Statement</w:t>
+            </w:r>
+          </w:p>
+        </w:tc>
+        <w:tc>
+          <w:tcPr/>
+          <w:p>
+            <w:pPr>
+              <w:pStyle w:val="Compact"/>
+              <w:jc w:val="left"/>
+            </w:pPr>
+            <w:r>
+              <w:t xml:space="preserve">Enforced in</w:t>
             </w:r>
           </w:p>
         </w:tc>
@@ -34081,7 +34467,7 @@
               <w:jc w:val="left"/>
             </w:pPr>
             <w:r>
-              <w:t xml:space="preserve">R-BIL-04-D-2</w:t>
+              <w:t xml:space="preserve">R-BIL-03-C-5</w:t>
             </w:r>
           </w:p>
         </w:tc>
@@ -34093,7 +34479,7 @@
               <w:jc w:val="left"/>
             </w:pPr>
             <w:r>
-              <w:t xml:space="preserve">dunning advances one level per pass</w:t>
+              <w:t xml:space="preserve">a window closes at most once</w:t>
             </w:r>
           </w:p>
         </w:tc>
@@ -34108,7 +34494,7 @@
               <w:rPr>
                 <w:rStyle w:val="VerbatimChar"/>
               </w:rPr>
-              <w:t xml:space="preserve">assessAccount</w:t>
+              <w:t xml:space="preserve">CycleCloseService::closeCycle</w:t>
             </w:r>
           </w:p>
         </w:tc>
@@ -34122,7 +34508,7 @@
               <w:jc w:val="left"/>
             </w:pPr>
             <w:r>
-              <w:t xml:space="preserve">R-GEN-01-Q-2/3</w:t>
+              <w:t xml:space="preserve">R-BIL-03-C-3/W-1</w:t>
             </w:r>
           </w:p>
         </w:tc>
@@ -34134,16 +34520,7 @@
               <w:jc w:val="left"/>
             </w:pPr>
             <w:r>
-              <w:t xml:space="preserve">failed generations retried then</w:t>
-            </w:r>
-            <w:r>
-              <w:t xml:space="preserve"> </w:t>
-            </w:r>
-            <w:r>
-              <w:rPr>
-                <w:rStyle w:val="VerbatimChar"/>
-              </w:rPr>
-              <w:t xml:space="preserve">GAVE_UP_AUTO</w:t>
+              <w:t xml:space="preserve">prepaid miss freezes anchor + dunning; unfreezes on top-up</w:t>
             </w:r>
           </w:p>
         </w:tc>
@@ -34158,7 +34535,19 @@
               <w:rPr>
                 <w:rStyle w:val="VerbatimChar"/>
               </w:rPr>
-              <w:t xml:space="preserve">GenerationFailureService::retryDue</w:t>
+              <w:t xml:space="preserve">CycleCloseService</w:t>
+            </w:r>
+            <w:r>
+              <w:t xml:space="preserve">,</w:t>
+            </w:r>
+            <w:r>
+              <w:t xml:space="preserve"> </w:t>
+            </w:r>
+            <w:r>
+              <w:rPr>
+                <w:rStyle w:val="VerbatimChar"/>
+              </w:rPr>
+              <w:t xml:space="preserve">RetryFrozenCycleOnTopup</w:t>
             </w:r>
           </w:p>
         </w:tc>
@@ -34172,7 +34561,7 @@
               <w:jc w:val="left"/>
             </w:pPr>
             <w:r>
-              <w:t xml:space="preserve">R-BIL-01-SC-1</w:t>
+              <w:t xml:space="preserve">R-BIL-04-C-1</w:t>
             </w:r>
           </w:p>
         </w:tc>
@@ -34184,22 +34573,7 @@
               <w:jc w:val="left"/>
             </w:pPr>
             <w:r>
-              <w:t xml:space="preserve">settled</w:t>
-            </w:r>
-            <w:r>
-              <w:t xml:space="preserve"> </w:t>
-            </w:r>
-            <w:r>
-              <w:rPr>
-                <w:rStyle w:val="VerbatimChar"/>
-              </w:rPr>
-              <w:t xml:space="preserve">state_callback</w:t>
-            </w:r>
-            <w:r>
-              <w:t xml:space="preserve"> </w:t>
-            </w:r>
-            <w:r>
-              <w:t xml:space="preserve">transitions the subscription</w:t>
+              <w:t xml:space="preserve">dunning program version pinned at entry</w:t>
             </w:r>
           </w:p>
         </w:tc>
@@ -34214,7 +34588,7 @@
               <w:rPr>
                 <w:rStyle w:val="VerbatimChar"/>
               </w:rPr>
-              <w:t xml:space="preserve">BillingIntentService</w:t>
+              <w:t xml:space="preserve">DunningService</w:t>
             </w:r>
           </w:p>
         </w:tc>
@@ -34228,7 +34602,7 @@
               <w:jc w:val="left"/>
             </w:pPr>
             <w:r>
-              <w:t xml:space="preserve">R-GEN-01-R-1</w:t>
+              <w:t xml:space="preserve">R-BIL-04-D-2</w:t>
             </w:r>
           </w:p>
         </w:tc>
@@ -34240,7 +34614,7 @@
               <w:jc w:val="left"/>
             </w:pPr>
             <w:r>
-              <w:t xml:space="preserve">bulk reversal dual-controlled (requester ≠ approver)</w:t>
+              <w:t xml:space="preserve">dunning advances one level per pass</w:t>
             </w:r>
           </w:p>
         </w:tc>
@@ -34255,7 +34629,169 @@
               <w:rPr>
                 <w:rStyle w:val="VerbatimChar"/>
               </w:rPr>
+              <w:t xml:space="preserve">assessAccount</w:t>
+            </w:r>
+          </w:p>
+        </w:tc>
+      </w:tr>
+      <w:tr>
+        <w:tc>
+          <w:tcPr/>
+          <w:p>
+            <w:pPr>
+              <w:pStyle w:val="Compact"/>
+              <w:jc w:val="left"/>
+            </w:pPr>
+            <w:r>
+              <w:t xml:space="preserve">R-GEN-01-Q-2/3</w:t>
+            </w:r>
+          </w:p>
+        </w:tc>
+        <w:tc>
+          <w:tcPr/>
+          <w:p>
+            <w:pPr>
+              <w:pStyle w:val="Compact"/>
+              <w:jc w:val="left"/>
+            </w:pPr>
+            <w:r>
+              <w:t xml:space="preserve">failed generations retried then</w:t>
+            </w:r>
+            <w:r>
+              <w:t xml:space="preserve"> </w:t>
+            </w:r>
+            <w:r>
+              <w:rPr>
+                <w:rStyle w:val="VerbatimChar"/>
+              </w:rPr>
+              <w:t xml:space="preserve">GAVE_UP_AUTO</w:t>
+            </w:r>
+          </w:p>
+        </w:tc>
+        <w:tc>
+          <w:tcPr/>
+          <w:p>
+            <w:pPr>
+              <w:pStyle w:val="Compact"/>
+              <w:jc w:val="left"/>
+            </w:pPr>
+            <w:r>
+              <w:rPr>
+                <w:rStyle w:val="VerbatimChar"/>
+              </w:rPr>
+              <w:t xml:space="preserve">GenerationFailureService::retryDue</w:t>
+            </w:r>
+          </w:p>
+        </w:tc>
+      </w:tr>
+      <w:tr>
+        <w:tc>
+          <w:tcPr/>
+          <w:p>
+            <w:pPr>
+              <w:pStyle w:val="Compact"/>
+              <w:jc w:val="left"/>
+            </w:pPr>
+            <w:r>
+              <w:t xml:space="preserve">R-BIL-01-SC-1</w:t>
+            </w:r>
+          </w:p>
+        </w:tc>
+        <w:tc>
+          <w:tcPr/>
+          <w:p>
+            <w:pPr>
+              <w:pStyle w:val="Compact"/>
+              <w:jc w:val="left"/>
+            </w:pPr>
+            <w:r>
+              <w:t xml:space="preserve">settled</w:t>
+            </w:r>
+            <w:r>
+              <w:t xml:space="preserve"> </w:t>
+            </w:r>
+            <w:r>
+              <w:rPr>
+                <w:rStyle w:val="VerbatimChar"/>
+              </w:rPr>
+              <w:t xml:space="preserve">state_callback</w:t>
+            </w:r>
+            <w:r>
+              <w:t xml:space="preserve"> </w:t>
+            </w:r>
+            <w:r>
+              <w:t xml:space="preserve">transitions the subscription</w:t>
+            </w:r>
+          </w:p>
+        </w:tc>
+        <w:tc>
+          <w:tcPr/>
+          <w:p>
+            <w:pPr>
+              <w:pStyle w:val="Compact"/>
+              <w:jc w:val="left"/>
+            </w:pPr>
+            <w:r>
+              <w:rPr>
+                <w:rStyle w:val="VerbatimChar"/>
+              </w:rPr>
+              <w:t xml:space="preserve">BillingIntentService</w:t>
+            </w:r>
+          </w:p>
+        </w:tc>
+      </w:tr>
+      <w:tr>
+        <w:tc>
+          <w:tcPr/>
+          <w:p>
+            <w:pPr>
+              <w:pStyle w:val="Compact"/>
+              <w:jc w:val="left"/>
+            </w:pPr>
+            <w:r>
+              <w:t xml:space="preserve">R-GEN-01-R-1</w:t>
+            </w:r>
+          </w:p>
+        </w:tc>
+        <w:tc>
+          <w:tcPr/>
+          <w:p>
+            <w:pPr>
+              <w:pStyle w:val="Compact"/>
+              <w:jc w:val="left"/>
+            </w:pPr>
+            <w:r>
+              <w:t xml:space="preserve">bulk reversal dual-controlled (requester ≠ approver), enforced by the EM-CFG-04 gate</w:t>
+            </w:r>
+          </w:p>
+        </w:tc>
+        <w:tc>
+          <w:tcPr/>
+          <w:p>
+            <w:pPr>
+              <w:pStyle w:val="Compact"/>
+              <w:jc w:val="left"/>
+            </w:pPr>
+            <w:r>
+              <w:rPr>
+                <w:rStyle w:val="VerbatimChar"/>
+              </w:rPr>
               <w:t xml:space="preserve">BulkReversalService</w:t>
+            </w:r>
+            <w:r>
+              <w:t xml:space="preserve"> </w:t>
+            </w:r>
+            <w:r>
+              <w:t xml:space="preserve">→</w:t>
+            </w:r>
+            <w:r>
+              <w:t xml:space="preserve"> </w:t>
+            </w:r>
+            <w:r>
+              <w:rPr>
+                <w:rStyle w:val="VerbatimChar"/>
+              </w:rPr>
+              <w:t xml:space="preserve">ApprovalService</w:t>
             </w:r>
           </w:p>
         </w:tc>

</xml_diff>